<commit_message>
feat(screenshots): update screenshots document with new content
</commit_message>
<xml_diff>
--- a/nipanze_screenshots.docx
+++ b/nipanze_screenshots.docx
@@ -81,12 +81,12 @@
                 <wp:inline distB="114300" distT="114300" distL="114300" distR="114300">
                   <wp:extent cx="1847850" cy="3263900"/>
                   <wp:effectExtent b="0" l="0" r="0" t="0"/>
-                  <wp:docPr id="31" name="image40.png"/>
+                  <wp:docPr id="36" name="image41.png"/>
                   <a:graphic>
                     <a:graphicData uri="http://schemas.openxmlformats.org/drawingml/2006/picture">
                       <pic:pic>
                         <pic:nvPicPr>
-                          <pic:cNvPr id="0" name="image40.png"/>
+                          <pic:cNvPr id="0" name="image41.png"/>
                           <pic:cNvPicPr preferRelativeResize="0"/>
                         </pic:nvPicPr>
                         <pic:blipFill>
@@ -153,7 +153,7 @@
                 <wp:inline distB="114300" distT="114300" distL="114300" distR="114300">
                   <wp:extent cx="1847850" cy="3263900"/>
                   <wp:effectExtent b="0" l="0" r="0" t="0"/>
-                  <wp:docPr id="30" name="image39.png"/>
+                  <wp:docPr id="35" name="image39.png"/>
                   <a:graphic>
                     <a:graphicData uri="http://schemas.openxmlformats.org/drawingml/2006/picture">
                       <pic:pic>
@@ -225,12 +225,12 @@
                 <wp:inline distB="114300" distT="114300" distL="114300" distR="114300">
                   <wp:extent cx="1847850" cy="3263900"/>
                   <wp:effectExtent b="0" l="0" r="0" t="0"/>
-                  <wp:docPr id="33" name="image27.png"/>
+                  <wp:docPr id="38" name="image31.png"/>
                   <a:graphic>
                     <a:graphicData uri="http://schemas.openxmlformats.org/drawingml/2006/picture">
                       <pic:pic>
                         <pic:nvPicPr>
-                          <pic:cNvPr id="0" name="image27.png"/>
+                          <pic:cNvPr id="0" name="image31.png"/>
                           <pic:cNvPicPr preferRelativeResize="0"/>
                         </pic:nvPicPr>
                         <pic:blipFill>
@@ -420,12 +420,12 @@
                 <wp:inline distB="114300" distT="114300" distL="114300" distR="114300">
                   <wp:extent cx="1847850" cy="3263900"/>
                   <wp:effectExtent b="0" l="0" r="0" t="0"/>
-                  <wp:docPr id="16" name="image16.png"/>
+                  <wp:docPr id="19" name="image6.png"/>
                   <a:graphic>
                     <a:graphicData uri="http://schemas.openxmlformats.org/drawingml/2006/picture">
                       <pic:pic>
                         <pic:nvPicPr>
-                          <pic:cNvPr id="0" name="image16.png"/>
+                          <pic:cNvPr id="0" name="image6.png"/>
                           <pic:cNvPicPr preferRelativeResize="0"/>
                         </pic:nvPicPr>
                         <pic:blipFill>
@@ -572,12 +572,12 @@
                 <wp:inline distB="114300" distT="114300" distL="114300" distR="114300">
                   <wp:extent cx="1847850" cy="3302000"/>
                   <wp:effectExtent b="0" l="0" r="0" t="0"/>
-                  <wp:docPr id="35" name="image37.png"/>
+                  <wp:docPr id="40" name="image36.png"/>
                   <a:graphic>
                     <a:graphicData uri="http://schemas.openxmlformats.org/drawingml/2006/picture">
                       <pic:pic>
                         <pic:nvPicPr>
-                          <pic:cNvPr id="0" name="image37.png"/>
+                          <pic:cNvPr id="0" name="image36.png"/>
                           <pic:cNvPicPr preferRelativeResize="0"/>
                         </pic:nvPicPr>
                         <pic:blipFill>
@@ -644,12 +644,12 @@
                 <wp:inline distB="114300" distT="114300" distL="114300" distR="114300">
                   <wp:extent cx="1847850" cy="3302000"/>
                   <wp:effectExtent b="0" l="0" r="0" t="0"/>
-                  <wp:docPr id="19" name="image5.png"/>
+                  <wp:docPr id="23" name="image26.png"/>
                   <a:graphic>
                     <a:graphicData uri="http://schemas.openxmlformats.org/drawingml/2006/picture">
                       <pic:pic>
                         <pic:nvPicPr>
-                          <pic:cNvPr id="0" name="image5.png"/>
+                          <pic:cNvPr id="0" name="image26.png"/>
                           <pic:cNvPicPr preferRelativeResize="0"/>
                         </pic:nvPicPr>
                         <pic:blipFill>
@@ -716,12 +716,12 @@
                 <wp:inline distB="114300" distT="114300" distL="114300" distR="114300">
                   <wp:extent cx="1847850" cy="3302000"/>
                   <wp:effectExtent b="0" l="0" r="0" t="0"/>
-                  <wp:docPr id="32" name="image28.png"/>
+                  <wp:docPr id="37" name="image33.png"/>
                   <a:graphic>
                     <a:graphicData uri="http://schemas.openxmlformats.org/drawingml/2006/picture">
                       <pic:pic>
                         <pic:nvPicPr>
-                          <pic:cNvPr id="0" name="image28.png"/>
+                          <pic:cNvPr id="0" name="image33.png"/>
                           <pic:cNvPicPr preferRelativeResize="0"/>
                         </pic:nvPicPr>
                         <pic:blipFill>
@@ -911,12 +911,12 @@
                 <wp:inline distB="114300" distT="114300" distL="114300" distR="114300">
                   <wp:extent cx="1847850" cy="3302000"/>
                   <wp:effectExtent b="0" l="0" r="0" t="0"/>
-                  <wp:docPr id="17" name="image19.png"/>
+                  <wp:docPr id="20" name="image20.png"/>
                   <a:graphic>
                     <a:graphicData uri="http://schemas.openxmlformats.org/drawingml/2006/picture">
                       <pic:pic>
                         <pic:nvPicPr>
-                          <pic:cNvPr id="0" name="image19.png"/>
+                          <pic:cNvPr id="0" name="image20.png"/>
                           <pic:cNvPicPr preferRelativeResize="0"/>
                         </pic:nvPicPr>
                         <pic:blipFill>
@@ -983,12 +983,12 @@
                 <wp:inline distB="114300" distT="114300" distL="114300" distR="114300">
                   <wp:extent cx="1847850" cy="3302000"/>
                   <wp:effectExtent b="0" l="0" r="0" t="0"/>
-                  <wp:docPr id="11" name="image15.png"/>
+                  <wp:docPr id="14" name="image13.png"/>
                   <a:graphic>
                     <a:graphicData uri="http://schemas.openxmlformats.org/drawingml/2006/picture">
                       <pic:pic>
                         <pic:nvPicPr>
-                          <pic:cNvPr id="0" name="image15.png"/>
+                          <pic:cNvPr id="0" name="image13.png"/>
                           <pic:cNvPicPr preferRelativeResize="0"/>
                         </pic:nvPicPr>
                         <pic:blipFill>
@@ -1055,12 +1055,12 @@
                 <wp:inline distB="114300" distT="114300" distL="114300" distR="114300">
                   <wp:extent cx="1847850" cy="3302000"/>
                   <wp:effectExtent b="0" l="0" r="0" t="0"/>
-                  <wp:docPr id="1" name="image11.png"/>
+                  <wp:docPr id="1" name="image14.png"/>
                   <a:graphic>
                     <a:graphicData uri="http://schemas.openxmlformats.org/drawingml/2006/picture">
                       <pic:pic>
                         <pic:nvPicPr>
-                          <pic:cNvPr id="0" name="image11.png"/>
+                          <pic:cNvPr id="0" name="image14.png"/>
                           <pic:cNvPicPr preferRelativeResize="0"/>
                         </pic:nvPicPr>
                         <pic:blipFill>
@@ -1250,12 +1250,12 @@
                 <wp:inline distB="114300" distT="114300" distL="114300" distR="114300">
                   <wp:extent cx="1847850" cy="3302000"/>
                   <wp:effectExtent b="0" l="0" r="0" t="0"/>
-                  <wp:docPr id="8" name="image1.png"/>
+                  <wp:docPr id="11" name="image3.png"/>
                   <a:graphic>
                     <a:graphicData uri="http://schemas.openxmlformats.org/drawingml/2006/picture">
                       <pic:pic>
                         <pic:nvPicPr>
-                          <pic:cNvPr id="0" name="image1.png"/>
+                          <pic:cNvPr id="0" name="image3.png"/>
                           <pic:cNvPicPr preferRelativeResize="0"/>
                         </pic:nvPicPr>
                         <pic:blipFill>
@@ -1322,12 +1322,12 @@
                 <wp:inline distB="114300" distT="114300" distL="114300" distR="114300">
                   <wp:extent cx="1847850" cy="3302000"/>
                   <wp:effectExtent b="0" l="0" r="0" t="0"/>
-                  <wp:docPr id="37" name="image30.png"/>
+                  <wp:docPr id="42" name="image37.png"/>
                   <a:graphic>
                     <a:graphicData uri="http://schemas.openxmlformats.org/drawingml/2006/picture">
                       <pic:pic>
                         <pic:nvPicPr>
-                          <pic:cNvPr id="0" name="image30.png"/>
+                          <pic:cNvPr id="0" name="image37.png"/>
                           <pic:cNvPicPr preferRelativeResize="0"/>
                         </pic:nvPicPr>
                         <pic:blipFill>
@@ -1394,7 +1394,7 @@
                 <wp:inline distB="114300" distT="114300" distL="114300" distR="114300">
                   <wp:extent cx="1847850" cy="3302000"/>
                   <wp:effectExtent b="0" l="0" r="0" t="0"/>
-                  <wp:docPr id="7" name="image17.png"/>
+                  <wp:docPr id="10" name="image17.png"/>
                   <a:graphic>
                     <a:graphicData uri="http://schemas.openxmlformats.org/drawingml/2006/picture">
                       <pic:pic>
@@ -1589,12 +1589,12 @@
                 <wp:inline distB="114300" distT="114300" distL="114300" distR="114300">
                   <wp:extent cx="1847850" cy="3302000"/>
                   <wp:effectExtent b="0" l="0" r="0" t="0"/>
-                  <wp:docPr id="14" name="image18.png"/>
+                  <wp:docPr id="17" name="image10.png"/>
                   <a:graphic>
                     <a:graphicData uri="http://schemas.openxmlformats.org/drawingml/2006/picture">
                       <pic:pic>
                         <pic:nvPicPr>
-                          <pic:cNvPr id="0" name="image18.png"/>
+                          <pic:cNvPr id="0" name="image10.png"/>
                           <pic:cNvPicPr preferRelativeResize="0"/>
                         </pic:nvPicPr>
                         <pic:blipFill>
@@ -1661,12 +1661,12 @@
                 <wp:inline distB="114300" distT="114300" distL="114300" distR="114300">
                   <wp:extent cx="1847850" cy="3302000"/>
                   <wp:effectExtent b="0" l="0" r="0" t="0"/>
-                  <wp:docPr id="36" name="image31.png"/>
+                  <wp:docPr id="41" name="image44.png"/>
                   <a:graphic>
                     <a:graphicData uri="http://schemas.openxmlformats.org/drawingml/2006/picture">
                       <pic:pic>
                         <pic:nvPicPr>
-                          <pic:cNvPr id="0" name="image31.png"/>
+                          <pic:cNvPr id="0" name="image44.png"/>
                           <pic:cNvPicPr preferRelativeResize="0"/>
                         </pic:nvPicPr>
                         <pic:blipFill>
@@ -1733,12 +1733,12 @@
                 <wp:inline distB="114300" distT="114300" distL="114300" distR="114300">
                   <wp:extent cx="1847850" cy="3302000"/>
                   <wp:effectExtent b="0" l="0" r="0" t="0"/>
-                  <wp:docPr id="9" name="image12.png"/>
+                  <wp:docPr id="12" name="image11.png"/>
                   <a:graphic>
                     <a:graphicData uri="http://schemas.openxmlformats.org/drawingml/2006/picture">
                       <pic:pic>
                         <pic:nvPicPr>
-                          <pic:cNvPr id="0" name="image12.png"/>
+                          <pic:cNvPr id="0" name="image11.png"/>
                           <pic:cNvPicPr preferRelativeResize="0"/>
                         </pic:nvPicPr>
                         <pic:blipFill>
@@ -1811,12 +1811,12 @@
                 <wp:inline distB="114300" distT="114300" distL="114300" distR="114300">
                   <wp:extent cx="1847850" cy="3302000"/>
                   <wp:effectExtent b="0" l="0" r="0" t="0"/>
-                  <wp:docPr id="20" name="image22.png"/>
+                  <wp:docPr id="24" name="image28.png"/>
                   <a:graphic>
                     <a:graphicData uri="http://schemas.openxmlformats.org/drawingml/2006/picture">
                       <pic:pic>
                         <pic:nvPicPr>
-                          <pic:cNvPr id="0" name="image22.png"/>
+                          <pic:cNvPr id="0" name="image28.png"/>
                           <pic:cNvPicPr preferRelativeResize="0"/>
                         </pic:nvPicPr>
                         <pic:blipFill>
@@ -1883,12 +1883,12 @@
                 <wp:inline distB="114300" distT="114300" distL="114300" distR="114300">
                   <wp:extent cx="1847850" cy="3302000"/>
                   <wp:effectExtent b="0" l="0" r="0" t="0"/>
-                  <wp:docPr id="38" name="image36.png"/>
+                  <wp:docPr id="43" name="image45.png"/>
                   <a:graphic>
                     <a:graphicData uri="http://schemas.openxmlformats.org/drawingml/2006/picture">
                       <pic:pic>
                         <pic:nvPicPr>
-                          <pic:cNvPr id="0" name="image36.png"/>
+                          <pic:cNvPr id="0" name="image45.png"/>
                           <pic:cNvPicPr preferRelativeResize="0"/>
                         </pic:nvPicPr>
                         <pic:blipFill>
@@ -1955,12 +1955,12 @@
                 <wp:inline distB="114300" distT="114300" distL="114300" distR="114300">
                   <wp:extent cx="1847850" cy="3302000"/>
                   <wp:effectExtent b="0" l="0" r="0" t="0"/>
-                  <wp:docPr id="21" name="image20.png"/>
+                  <wp:docPr id="25" name="image24.png"/>
                   <a:graphic>
                     <a:graphicData uri="http://schemas.openxmlformats.org/drawingml/2006/picture">
                       <pic:pic>
                         <pic:nvPicPr>
-                          <pic:cNvPr id="0" name="image20.png"/>
+                          <pic:cNvPr id="0" name="image24.png"/>
                           <pic:cNvPicPr preferRelativeResize="0"/>
                         </pic:nvPicPr>
                         <pic:blipFill>
@@ -2150,12 +2150,12 @@
                 <wp:inline distB="114300" distT="114300" distL="114300" distR="114300">
                   <wp:extent cx="1847850" cy="3302000"/>
                   <wp:effectExtent b="0" l="0" r="0" t="0"/>
-                  <wp:docPr id="6" name="image14.png"/>
+                  <wp:docPr id="9" name="image12.png"/>
                   <a:graphic>
                     <a:graphicData uri="http://schemas.openxmlformats.org/drawingml/2006/picture">
                       <pic:pic>
                         <pic:nvPicPr>
-                          <pic:cNvPr id="0" name="image14.png"/>
+                          <pic:cNvPr id="0" name="image12.png"/>
                           <pic:cNvPicPr preferRelativeResize="0"/>
                         </pic:nvPicPr>
                         <pic:blipFill>
@@ -2222,12 +2222,12 @@
                 <wp:inline distB="114300" distT="114300" distL="114300" distR="114300">
                   <wp:extent cx="1847850" cy="3302000"/>
                   <wp:effectExtent b="0" l="0" r="0" t="0"/>
-                  <wp:docPr id="27" name="image34.png"/>
+                  <wp:docPr id="32" name="image30.png"/>
                   <a:graphic>
                     <a:graphicData uri="http://schemas.openxmlformats.org/drawingml/2006/picture">
                       <pic:pic>
                         <pic:nvPicPr>
-                          <pic:cNvPr id="0" name="image34.png"/>
+                          <pic:cNvPr id="0" name="image30.png"/>
                           <pic:cNvPicPr preferRelativeResize="0"/>
                         </pic:nvPicPr>
                         <pic:blipFill>
@@ -2294,12 +2294,12 @@
                 <wp:inline distB="114300" distT="114300" distL="114300" distR="114300">
                   <wp:extent cx="1847850" cy="1536700"/>
                   <wp:effectExtent b="0" l="0" r="0" t="0"/>
-                  <wp:docPr id="12" name="image3.png"/>
+                  <wp:docPr id="15" name="image1.png"/>
                   <a:graphic>
                     <a:graphicData uri="http://schemas.openxmlformats.org/drawingml/2006/picture">
                       <pic:pic>
                         <pic:nvPicPr>
-                          <pic:cNvPr id="0" name="image3.png"/>
+                          <pic:cNvPr id="0" name="image1.png"/>
                           <pic:cNvPicPr preferRelativeResize="0"/>
                         </pic:nvPicPr>
                         <pic:blipFill>
@@ -2489,12 +2489,12 @@
                 <wp:inline distB="114300" distT="114300" distL="114300" distR="114300">
                   <wp:extent cx="1847850" cy="3263900"/>
                   <wp:effectExtent b="0" l="0" r="0" t="0"/>
-                  <wp:docPr id="42" name="image42.png"/>
+                  <wp:docPr id="47" name="image43.png"/>
                   <a:graphic>
                     <a:graphicData uri="http://schemas.openxmlformats.org/drawingml/2006/picture">
                       <pic:pic>
                         <pic:nvPicPr>
-                          <pic:cNvPr id="0" name="image42.png"/>
+                          <pic:cNvPr id="0" name="image43.png"/>
                           <pic:cNvPicPr preferRelativeResize="0"/>
                         </pic:nvPicPr>
                         <pic:blipFill>
@@ -2561,12 +2561,12 @@
                 <wp:inline distB="114300" distT="114300" distL="114300" distR="114300">
                   <wp:extent cx="1847850" cy="3263900"/>
                   <wp:effectExtent b="0" l="0" r="0" t="0"/>
-                  <wp:docPr id="4" name="image2.png"/>
+                  <wp:docPr id="7" name="image16.png"/>
                   <a:graphic>
                     <a:graphicData uri="http://schemas.openxmlformats.org/drawingml/2006/picture">
                       <pic:pic>
                         <pic:nvPicPr>
-                          <pic:cNvPr id="0" name="image2.png"/>
+                          <pic:cNvPr id="0" name="image16.png"/>
                           <pic:cNvPicPr preferRelativeResize="0"/>
                         </pic:nvPicPr>
                         <pic:blipFill>
@@ -2633,12 +2633,12 @@
                 <wp:inline distB="114300" distT="114300" distL="114300" distR="114300">
                   <wp:extent cx="1847850" cy="3263900"/>
                   <wp:effectExtent b="0" l="0" r="0" t="0"/>
-                  <wp:docPr id="24" name="image35.png"/>
+                  <wp:docPr id="28" name="image34.png"/>
                   <a:graphic>
                     <a:graphicData uri="http://schemas.openxmlformats.org/drawingml/2006/picture">
                       <pic:pic>
                         <pic:nvPicPr>
-                          <pic:cNvPr id="0" name="image35.png"/>
+                          <pic:cNvPr id="0" name="image34.png"/>
                           <pic:cNvPicPr preferRelativeResize="0"/>
                         </pic:nvPicPr>
                         <pic:blipFill>
@@ -2828,12 +2828,12 @@
                 <wp:inline distB="114300" distT="114300" distL="114300" distR="114300">
                   <wp:extent cx="1847850" cy="3263900"/>
                   <wp:effectExtent b="0" l="0" r="0" t="0"/>
-                  <wp:docPr id="34" name="image33.png"/>
+                  <wp:docPr id="39" name="image35.png"/>
                   <a:graphic>
                     <a:graphicData uri="http://schemas.openxmlformats.org/drawingml/2006/picture">
                       <pic:pic>
                         <pic:nvPicPr>
-                          <pic:cNvPr id="0" name="image33.png"/>
+                          <pic:cNvPr id="0" name="image35.png"/>
                           <pic:cNvPicPr preferRelativeResize="0"/>
                         </pic:nvPicPr>
                         <pic:blipFill>
@@ -2900,12 +2900,12 @@
                 <wp:inline distB="114300" distT="114300" distL="114300" distR="114300">
                   <wp:extent cx="1847850" cy="3263900"/>
                   <wp:effectExtent b="0" l="0" r="0" t="0"/>
-                  <wp:docPr id="41" name="image41.png"/>
+                  <wp:docPr id="46" name="image47.png"/>
                   <a:graphic>
                     <a:graphicData uri="http://schemas.openxmlformats.org/drawingml/2006/picture">
                       <pic:pic>
                         <pic:nvPicPr>
-                          <pic:cNvPr id="0" name="image41.png"/>
+                          <pic:cNvPr id="0" name="image47.png"/>
                           <pic:cNvPicPr preferRelativeResize="0"/>
                         </pic:nvPicPr>
                         <pic:blipFill>
@@ -2972,12 +2972,12 @@
                 <wp:inline distB="114300" distT="114300" distL="114300" distR="114300">
                   <wp:extent cx="1847850" cy="3263900"/>
                   <wp:effectExtent b="0" l="0" r="0" t="0"/>
-                  <wp:docPr id="3" name="image10.png"/>
+                  <wp:docPr id="5" name="image7.png"/>
                   <a:graphic>
                     <a:graphicData uri="http://schemas.openxmlformats.org/drawingml/2006/picture">
                       <pic:pic>
                         <pic:nvPicPr>
-                          <pic:cNvPr id="0" name="image10.png"/>
+                          <pic:cNvPr id="0" name="image7.png"/>
                           <pic:cNvPicPr preferRelativeResize="0"/>
                         </pic:nvPicPr>
                         <pic:blipFill>
@@ -3167,12 +3167,12 @@
                 <wp:inline distB="114300" distT="114300" distL="114300" distR="114300">
                   <wp:extent cx="1847850" cy="3263900"/>
                   <wp:effectExtent b="0" l="0" r="0" t="0"/>
-                  <wp:docPr id="40" name="image38.png"/>
+                  <wp:docPr id="45" name="image46.png"/>
                   <a:graphic>
                     <a:graphicData uri="http://schemas.openxmlformats.org/drawingml/2006/picture">
                       <pic:pic>
                         <pic:nvPicPr>
-                          <pic:cNvPr id="0" name="image38.png"/>
+                          <pic:cNvPr id="0" name="image46.png"/>
                           <pic:cNvPicPr preferRelativeResize="0"/>
                         </pic:nvPicPr>
                         <pic:blipFill>
@@ -3239,12 +3239,12 @@
                 <wp:inline distB="114300" distT="114300" distL="114300" distR="114300">
                   <wp:extent cx="1847850" cy="3263900"/>
                   <wp:effectExtent b="0" l="0" r="0" t="0"/>
-                  <wp:docPr id="2" name="image6.png"/>
+                  <wp:docPr id="4" name="image5.png"/>
                   <a:graphic>
                     <a:graphicData uri="http://schemas.openxmlformats.org/drawingml/2006/picture">
                       <pic:pic>
                         <pic:nvPicPr>
-                          <pic:cNvPr id="0" name="image6.png"/>
+                          <pic:cNvPr id="0" name="image5.png"/>
                           <pic:cNvPicPr preferRelativeResize="0"/>
                         </pic:nvPicPr>
                         <pic:blipFill>
@@ -3311,12 +3311,12 @@
                 <wp:inline distB="114300" distT="114300" distL="114300" distR="114300">
                   <wp:extent cx="1847850" cy="3263900"/>
                   <wp:effectExtent b="0" l="0" r="0" t="0"/>
-                  <wp:docPr id="5" name="image4.png"/>
+                  <wp:docPr id="8" name="image2.png"/>
                   <a:graphic>
                     <a:graphicData uri="http://schemas.openxmlformats.org/drawingml/2006/picture">
                       <pic:pic>
                         <pic:nvPicPr>
-                          <pic:cNvPr id="0" name="image4.png"/>
+                          <pic:cNvPr id="0" name="image2.png"/>
                           <pic:cNvPicPr preferRelativeResize="0"/>
                         </pic:nvPicPr>
                         <pic:blipFill>
@@ -3506,12 +3506,12 @@
                 <wp:inline distB="114300" distT="114300" distL="114300" distR="114300">
                   <wp:extent cx="1847850" cy="3263900"/>
                   <wp:effectExtent b="0" l="0" r="0" t="0"/>
-                  <wp:docPr id="22" name="image21.png"/>
+                  <wp:docPr id="26" name="image27.png"/>
                   <a:graphic>
                     <a:graphicData uri="http://schemas.openxmlformats.org/drawingml/2006/picture">
                       <pic:pic>
                         <pic:nvPicPr>
-                          <pic:cNvPr id="0" name="image21.png"/>
+                          <pic:cNvPr id="0" name="image27.png"/>
                           <pic:cNvPicPr preferRelativeResize="0"/>
                         </pic:nvPicPr>
                         <pic:blipFill>
@@ -3578,12 +3578,12 @@
                 <wp:inline distB="114300" distT="114300" distL="114300" distR="114300">
                   <wp:extent cx="1847850" cy="3263900"/>
                   <wp:effectExtent b="0" l="0" r="0" t="0"/>
-                  <wp:docPr id="18" name="image7.png"/>
+                  <wp:docPr id="21" name="image21.png"/>
                   <a:graphic>
                     <a:graphicData uri="http://schemas.openxmlformats.org/drawingml/2006/picture">
                       <pic:pic>
                         <pic:nvPicPr>
-                          <pic:cNvPr id="0" name="image7.png"/>
+                          <pic:cNvPr id="0" name="image21.png"/>
                           <pic:cNvPicPr preferRelativeResize="0"/>
                         </pic:nvPicPr>
                         <pic:blipFill>
@@ -3650,12 +3650,12 @@
                 <wp:inline distB="114300" distT="114300" distL="114300" distR="114300">
                   <wp:extent cx="1847850" cy="3263900"/>
                   <wp:effectExtent b="0" l="0" r="0" t="0"/>
-                  <wp:docPr id="10" name="image13.png"/>
+                  <wp:docPr id="13" name="image19.png"/>
                   <a:graphic>
                     <a:graphicData uri="http://schemas.openxmlformats.org/drawingml/2006/picture">
                       <pic:pic>
                         <pic:nvPicPr>
-                          <pic:cNvPr id="0" name="image13.png"/>
+                          <pic:cNvPr id="0" name="image19.png"/>
                           <pic:cNvPicPr preferRelativeResize="0"/>
                         </pic:nvPicPr>
                         <pic:blipFill>
@@ -3845,12 +3845,12 @@
                 <wp:inline distB="114300" distT="114300" distL="114300" distR="114300">
                   <wp:extent cx="1847850" cy="3263900"/>
                   <wp:effectExtent b="0" l="0" r="0" t="0"/>
-                  <wp:docPr id="26" name="image29.png"/>
+                  <wp:docPr id="30" name="image38.png"/>
                   <a:graphic>
                     <a:graphicData uri="http://schemas.openxmlformats.org/drawingml/2006/picture">
                       <pic:pic>
                         <pic:nvPicPr>
-                          <pic:cNvPr id="0" name="image29.png"/>
+                          <pic:cNvPr id="0" name="image38.png"/>
                           <pic:cNvPicPr preferRelativeResize="0"/>
                         </pic:nvPicPr>
                         <pic:blipFill>
@@ -3917,12 +3917,12 @@
                 <wp:inline distB="114300" distT="114300" distL="114300" distR="114300">
                   <wp:extent cx="1847850" cy="3263900"/>
                   <wp:effectExtent b="0" l="0" r="0" t="0"/>
-                  <wp:docPr id="13" name="image8.png"/>
+                  <wp:docPr id="16" name="image4.png"/>
                   <a:graphic>
                     <a:graphicData uri="http://schemas.openxmlformats.org/drawingml/2006/picture">
                       <pic:pic>
                         <pic:nvPicPr>
-                          <pic:cNvPr id="0" name="image8.png"/>
+                          <pic:cNvPr id="0" name="image4.png"/>
                           <pic:cNvPicPr preferRelativeResize="0"/>
                         </pic:nvPicPr>
                         <pic:blipFill>
@@ -3989,12 +3989,12 @@
                 <wp:inline distB="114300" distT="114300" distL="114300" distR="114300">
                   <wp:extent cx="1847850" cy="3263900"/>
                   <wp:effectExtent b="0" l="0" r="0" t="0"/>
-                  <wp:docPr id="15" name="image9.png"/>
+                  <wp:docPr id="18" name="image15.png"/>
                   <a:graphic>
                     <a:graphicData uri="http://schemas.openxmlformats.org/drawingml/2006/picture">
                       <pic:pic>
                         <pic:nvPicPr>
-                          <pic:cNvPr id="0" name="image9.png"/>
+                          <pic:cNvPr id="0" name="image15.png"/>
                           <pic:cNvPicPr preferRelativeResize="0"/>
                         </pic:nvPicPr>
                         <pic:blipFill>
@@ -4067,12 +4067,12 @@
                 <wp:inline distB="114300" distT="114300" distL="114300" distR="114300">
                   <wp:extent cx="1847850" cy="3263900"/>
                   <wp:effectExtent b="0" l="0" r="0" t="0"/>
-                  <wp:docPr id="39" name="image32.png"/>
+                  <wp:docPr id="44" name="image42.png"/>
                   <a:graphic>
                     <a:graphicData uri="http://schemas.openxmlformats.org/drawingml/2006/picture">
                       <pic:pic>
                         <pic:nvPicPr>
-                          <pic:cNvPr id="0" name="image32.png"/>
+                          <pic:cNvPr id="0" name="image42.png"/>
                           <pic:cNvPicPr preferRelativeResize="0"/>
                         </pic:nvPicPr>
                         <pic:blipFill>
@@ -4139,12 +4139,12 @@
                 <wp:inline distB="114300" distT="114300" distL="114300" distR="114300">
                   <wp:extent cx="1847850" cy="3263900"/>
                   <wp:effectExtent b="0" l="0" r="0" t="0"/>
-                  <wp:docPr id="25" name="image26.png"/>
+                  <wp:docPr id="29" name="image25.png"/>
                   <a:graphic>
                     <a:graphicData uri="http://schemas.openxmlformats.org/drawingml/2006/picture">
                       <pic:pic>
                         <pic:nvPicPr>
-                          <pic:cNvPr id="0" name="image26.png"/>
+                          <pic:cNvPr id="0" name="image25.png"/>
                           <pic:cNvPicPr preferRelativeResize="0"/>
                         </pic:nvPicPr>
                         <pic:blipFill>
@@ -4211,12 +4211,12 @@
                 <wp:inline distB="114300" distT="114300" distL="114300" distR="114300">
                   <wp:extent cx="1847850" cy="3263900"/>
                   <wp:effectExtent b="0" l="0" r="0" t="0"/>
-                  <wp:docPr id="23" name="image23.png"/>
+                  <wp:docPr id="27" name="image40.png"/>
                   <a:graphic>
                     <a:graphicData uri="http://schemas.openxmlformats.org/drawingml/2006/picture">
                       <pic:pic>
                         <pic:nvPicPr>
-                          <pic:cNvPr id="0" name="image23.png"/>
+                          <pic:cNvPr id="0" name="image40.png"/>
                           <pic:cNvPicPr preferRelativeResize="0"/>
                         </pic:nvPicPr>
                         <pic:blipFill>
@@ -4406,12 +4406,12 @@
                 <wp:inline distB="114300" distT="114300" distL="114300" distR="114300">
                   <wp:extent cx="1847850" cy="3263900"/>
                   <wp:effectExtent b="0" l="0" r="0" t="0"/>
-                  <wp:docPr id="29" name="image25.png"/>
+                  <wp:docPr id="34" name="image29.png"/>
                   <a:graphic>
                     <a:graphicData uri="http://schemas.openxmlformats.org/drawingml/2006/picture">
                       <pic:pic>
                         <pic:nvPicPr>
-                          <pic:cNvPr id="0" name="image25.png"/>
+                          <pic:cNvPr id="0" name="image29.png"/>
                           <pic:cNvPicPr preferRelativeResize="0"/>
                         </pic:nvPicPr>
                         <pic:blipFill>
@@ -4478,12 +4478,12 @@
                 <wp:inline distB="114300" distT="114300" distL="114300" distR="114300">
                   <wp:extent cx="1847850" cy="3263900"/>
                   <wp:effectExtent b="0" l="0" r="0" t="0"/>
-                  <wp:docPr id="28" name="image24.png"/>
+                  <wp:docPr id="33" name="image23.png"/>
                   <a:graphic>
                     <a:graphicData uri="http://schemas.openxmlformats.org/drawingml/2006/picture">
                       <pic:pic>
                         <pic:nvPicPr>
-                          <pic:cNvPr id="0" name="image24.png"/>
+                          <pic:cNvPr id="0" name="image23.png"/>
                           <pic:cNvPicPr preferRelativeResize="0"/>
                         </pic:nvPicPr>
                         <pic:blipFill>
@@ -4507,6 +4507,883 @@
                 </wp:inline>
               </w:drawing>
             </w:r>
+            <w:r>
+              <w:rPr>
+                <w:rtl w:val="0"/>
+              </w:rPr>
+            </w:r>
+          </w:p>
+        </w:tc>
+        <w:tc>
+          <w:tcPr>
+            <w:shd w:fill="auto" w:val="clear"/>
+            <w:tcMar>
+              <w:top w:w="100.0" w:type="dxa"/>
+              <w:left w:w="100.0" w:type="dxa"/>
+              <w:bottom w:w="100.0" w:type="dxa"/>
+              <w:right w:w="100.0" w:type="dxa"/>
+            </w:tcMar>
+            <w:vAlign w:val="top"/>
+          </w:tcPr>
+          <w:p>
+            <w:pPr>
+              <w:keepNext w:val="0"/>
+              <w:keepLines w:val="0"/>
+              <w:pageBreakBefore w:val="0"/>
+              <w:widowControl w:val="0"/>
+              <w:pBdr>
+                <w:top w:space="0" w:sz="0" w:val="nil"/>
+                <w:left w:space="0" w:sz="0" w:val="nil"/>
+                <w:bottom w:space="0" w:sz="0" w:val="nil"/>
+                <w:right w:space="0" w:sz="0" w:val="nil"/>
+                <w:between w:space="0" w:sz="0" w:val="nil"/>
+              </w:pBdr>
+              <w:shd w:fill="auto" w:val="clear"/>
+              <w:spacing w:after="0" w:before="0" w:line="240" w:lineRule="auto"/>
+              <w:ind w:left="0" w:right="0" w:firstLine="0"/>
+              <w:jc w:val="left"/>
+              <w:rPr/>
+            </w:pPr>
+            <w:r>
+              <w:rPr/>
+              <w:drawing>
+                <wp:inline distB="114300" distT="114300" distL="114300" distR="114300">
+                  <wp:extent cx="1847850" cy="3263900"/>
+                  <wp:effectExtent b="0" l="0" r="0" t="0"/>
+                  <wp:docPr id="22" name="image22.png"/>
+                  <a:graphic>
+                    <a:graphicData uri="http://schemas.openxmlformats.org/drawingml/2006/picture">
+                      <pic:pic>
+                        <pic:nvPicPr>
+                          <pic:cNvPr id="0" name="image22.png"/>
+                          <pic:cNvPicPr preferRelativeResize="0"/>
+                        </pic:nvPicPr>
+                        <pic:blipFill>
+                          <a:blip r:embed="rId48"/>
+                          <a:srcRect b="0" l="0" r="0" t="0"/>
+                          <a:stretch>
+                            <a:fillRect/>
+                          </a:stretch>
+                        </pic:blipFill>
+                        <pic:spPr>
+                          <a:xfrm>
+                            <a:off x="0" y="0"/>
+                            <a:ext cx="1847850" cy="3263900"/>
+                          </a:xfrm>
+                          <a:prstGeom prst="rect"/>
+                          <a:ln/>
+                        </pic:spPr>
+                      </pic:pic>
+                    </a:graphicData>
+                  </a:graphic>
+                </wp:inline>
+              </w:drawing>
+            </w:r>
+            <w:r>
+              <w:rPr>
+                <w:rtl w:val="0"/>
+              </w:rPr>
+            </w:r>
+          </w:p>
+        </w:tc>
+      </w:tr>
+      <w:tr>
+        <w:trPr>
+          <w:cantSplit w:val="0"/>
+          <w:tblHeader w:val="0"/>
+        </w:trPr>
+        <w:tc>
+          <w:tcPr>
+            <w:shd w:fill="auto" w:val="clear"/>
+            <w:tcMar>
+              <w:top w:w="100.0" w:type="dxa"/>
+              <w:left w:w="100.0" w:type="dxa"/>
+              <w:bottom w:w="100.0" w:type="dxa"/>
+              <w:right w:w="100.0" w:type="dxa"/>
+            </w:tcMar>
+            <w:vAlign w:val="top"/>
+          </w:tcPr>
+          <w:p>
+            <w:pPr>
+              <w:keepNext w:val="0"/>
+              <w:keepLines w:val="0"/>
+              <w:pageBreakBefore w:val="0"/>
+              <w:widowControl w:val="0"/>
+              <w:pBdr>
+                <w:top w:space="0" w:sz="0" w:val="nil"/>
+                <w:left w:space="0" w:sz="0" w:val="nil"/>
+                <w:bottom w:space="0" w:sz="0" w:val="nil"/>
+                <w:right w:space="0" w:sz="0" w:val="nil"/>
+                <w:between w:space="0" w:sz="0" w:val="nil"/>
+              </w:pBdr>
+              <w:shd w:fill="auto" w:val="clear"/>
+              <w:spacing w:after="0" w:before="0" w:line="240" w:lineRule="auto"/>
+              <w:ind w:left="0" w:right="0" w:firstLine="0"/>
+              <w:jc w:val="left"/>
+              <w:rPr/>
+            </w:pPr>
+            <w:r>
+              <w:rPr>
+                <w:rtl w:val="0"/>
+              </w:rPr>
+            </w:r>
+          </w:p>
+        </w:tc>
+        <w:tc>
+          <w:tcPr>
+            <w:shd w:fill="auto" w:val="clear"/>
+            <w:tcMar>
+              <w:top w:w="100.0" w:type="dxa"/>
+              <w:left w:w="100.0" w:type="dxa"/>
+              <w:bottom w:w="100.0" w:type="dxa"/>
+              <w:right w:w="100.0" w:type="dxa"/>
+            </w:tcMar>
+            <w:vAlign w:val="top"/>
+          </w:tcPr>
+          <w:p>
+            <w:pPr>
+              <w:keepNext w:val="0"/>
+              <w:keepLines w:val="0"/>
+              <w:pageBreakBefore w:val="0"/>
+              <w:widowControl w:val="0"/>
+              <w:pBdr>
+                <w:top w:space="0" w:sz="0" w:val="nil"/>
+                <w:left w:space="0" w:sz="0" w:val="nil"/>
+                <w:bottom w:space="0" w:sz="0" w:val="nil"/>
+                <w:right w:space="0" w:sz="0" w:val="nil"/>
+                <w:between w:space="0" w:sz="0" w:val="nil"/>
+              </w:pBdr>
+              <w:shd w:fill="auto" w:val="clear"/>
+              <w:spacing w:after="0" w:before="0" w:line="240" w:lineRule="auto"/>
+              <w:ind w:left="0" w:right="0" w:firstLine="0"/>
+              <w:jc w:val="left"/>
+              <w:rPr/>
+            </w:pPr>
+            <w:r>
+              <w:rPr>
+                <w:rtl w:val="0"/>
+              </w:rPr>
+            </w:r>
+          </w:p>
+        </w:tc>
+        <w:tc>
+          <w:tcPr>
+            <w:shd w:fill="auto" w:val="clear"/>
+            <w:tcMar>
+              <w:top w:w="100.0" w:type="dxa"/>
+              <w:left w:w="100.0" w:type="dxa"/>
+              <w:bottom w:w="100.0" w:type="dxa"/>
+              <w:right w:w="100.0" w:type="dxa"/>
+            </w:tcMar>
+            <w:vAlign w:val="top"/>
+          </w:tcPr>
+          <w:p>
+            <w:pPr>
+              <w:keepNext w:val="0"/>
+              <w:keepLines w:val="0"/>
+              <w:pageBreakBefore w:val="0"/>
+              <w:widowControl w:val="0"/>
+              <w:pBdr>
+                <w:top w:space="0" w:sz="0" w:val="nil"/>
+                <w:left w:space="0" w:sz="0" w:val="nil"/>
+                <w:bottom w:space="0" w:sz="0" w:val="nil"/>
+                <w:right w:space="0" w:sz="0" w:val="nil"/>
+                <w:between w:space="0" w:sz="0" w:val="nil"/>
+              </w:pBdr>
+              <w:shd w:fill="auto" w:val="clear"/>
+              <w:spacing w:after="0" w:before="0" w:line="240" w:lineRule="auto"/>
+              <w:ind w:left="0" w:right="0" w:firstLine="0"/>
+              <w:jc w:val="left"/>
+              <w:rPr/>
+            </w:pPr>
+            <w:r>
+              <w:rPr>
+                <w:rtl w:val="0"/>
+              </w:rPr>
+            </w:r>
+          </w:p>
+        </w:tc>
+      </w:tr>
+      <w:tr>
+        <w:trPr>
+          <w:cantSplit w:val="0"/>
+          <w:tblHeader w:val="0"/>
+        </w:trPr>
+        <w:tc>
+          <w:tcPr>
+            <w:shd w:fill="auto" w:val="clear"/>
+            <w:tcMar>
+              <w:top w:w="100.0" w:type="dxa"/>
+              <w:left w:w="100.0" w:type="dxa"/>
+              <w:bottom w:w="100.0" w:type="dxa"/>
+              <w:right w:w="100.0" w:type="dxa"/>
+            </w:tcMar>
+            <w:vAlign w:val="top"/>
+          </w:tcPr>
+          <w:p>
+            <w:pPr>
+              <w:keepNext w:val="0"/>
+              <w:keepLines w:val="0"/>
+              <w:pageBreakBefore w:val="0"/>
+              <w:widowControl w:val="0"/>
+              <w:pBdr>
+                <w:top w:space="0" w:sz="0" w:val="nil"/>
+                <w:left w:space="0" w:sz="0" w:val="nil"/>
+                <w:bottom w:space="0" w:sz="0" w:val="nil"/>
+                <w:right w:space="0" w:sz="0" w:val="nil"/>
+                <w:between w:space="0" w:sz="0" w:val="nil"/>
+              </w:pBdr>
+              <w:shd w:fill="auto" w:val="clear"/>
+              <w:spacing w:after="0" w:before="0" w:line="240" w:lineRule="auto"/>
+              <w:ind w:left="0" w:right="0" w:firstLine="0"/>
+              <w:jc w:val="left"/>
+              <w:rPr/>
+            </w:pPr>
+            <w:r>
+              <w:rPr/>
+              <w:drawing>
+                <wp:inline distB="114300" distT="114300" distL="114300" distR="114300">
+                  <wp:extent cx="1847850" cy="3263900"/>
+                  <wp:effectExtent b="0" l="0" r="0" t="0"/>
+                  <wp:docPr id="3" name="image8.png"/>
+                  <a:graphic>
+                    <a:graphicData uri="http://schemas.openxmlformats.org/drawingml/2006/picture">
+                      <pic:pic>
+                        <pic:nvPicPr>
+                          <pic:cNvPr id="0" name="image8.png"/>
+                          <pic:cNvPicPr preferRelativeResize="0"/>
+                        </pic:nvPicPr>
+                        <pic:blipFill>
+                          <a:blip r:embed="rId49"/>
+                          <a:srcRect b="0" l="0" r="0" t="0"/>
+                          <a:stretch>
+                            <a:fillRect/>
+                          </a:stretch>
+                        </pic:blipFill>
+                        <pic:spPr>
+                          <a:xfrm>
+                            <a:off x="0" y="0"/>
+                            <a:ext cx="1847850" cy="3263900"/>
+                          </a:xfrm>
+                          <a:prstGeom prst="rect"/>
+                          <a:ln/>
+                        </pic:spPr>
+                      </pic:pic>
+                    </a:graphicData>
+                  </a:graphic>
+                </wp:inline>
+              </w:drawing>
+            </w:r>
+            <w:r>
+              <w:rPr>
+                <w:rtl w:val="0"/>
+              </w:rPr>
+            </w:r>
+          </w:p>
+        </w:tc>
+        <w:tc>
+          <w:tcPr>
+            <w:shd w:fill="auto" w:val="clear"/>
+            <w:tcMar>
+              <w:top w:w="100.0" w:type="dxa"/>
+              <w:left w:w="100.0" w:type="dxa"/>
+              <w:bottom w:w="100.0" w:type="dxa"/>
+              <w:right w:w="100.0" w:type="dxa"/>
+            </w:tcMar>
+            <w:vAlign w:val="top"/>
+          </w:tcPr>
+          <w:p>
+            <w:pPr>
+              <w:keepNext w:val="0"/>
+              <w:keepLines w:val="0"/>
+              <w:pageBreakBefore w:val="0"/>
+              <w:widowControl w:val="0"/>
+              <w:pBdr>
+                <w:top w:space="0" w:sz="0" w:val="nil"/>
+                <w:left w:space="0" w:sz="0" w:val="nil"/>
+                <w:bottom w:space="0" w:sz="0" w:val="nil"/>
+                <w:right w:space="0" w:sz="0" w:val="nil"/>
+                <w:between w:space="0" w:sz="0" w:val="nil"/>
+              </w:pBdr>
+              <w:shd w:fill="auto" w:val="clear"/>
+              <w:spacing w:after="0" w:before="0" w:line="240" w:lineRule="auto"/>
+              <w:ind w:left="0" w:right="0" w:firstLine="0"/>
+              <w:jc w:val="left"/>
+              <w:rPr/>
+            </w:pPr>
+            <w:r>
+              <w:rPr/>
+              <w:drawing>
+                <wp:inline distB="114300" distT="114300" distL="114300" distR="114300">
+                  <wp:extent cx="1847850" cy="3263900"/>
+                  <wp:effectExtent b="0" l="0" r="0" t="0"/>
+                  <wp:docPr id="2" name="image9.png"/>
+                  <a:graphic>
+                    <a:graphicData uri="http://schemas.openxmlformats.org/drawingml/2006/picture">
+                      <pic:pic>
+                        <pic:nvPicPr>
+                          <pic:cNvPr id="0" name="image9.png"/>
+                          <pic:cNvPicPr preferRelativeResize="0"/>
+                        </pic:nvPicPr>
+                        <pic:blipFill>
+                          <a:blip r:embed="rId50"/>
+                          <a:srcRect b="0" l="0" r="0" t="0"/>
+                          <a:stretch>
+                            <a:fillRect/>
+                          </a:stretch>
+                        </pic:blipFill>
+                        <pic:spPr>
+                          <a:xfrm>
+                            <a:off x="0" y="0"/>
+                            <a:ext cx="1847850" cy="3263900"/>
+                          </a:xfrm>
+                          <a:prstGeom prst="rect"/>
+                          <a:ln/>
+                        </pic:spPr>
+                      </pic:pic>
+                    </a:graphicData>
+                  </a:graphic>
+                </wp:inline>
+              </w:drawing>
+            </w:r>
+            <w:r>
+              <w:rPr>
+                <w:rtl w:val="0"/>
+              </w:rPr>
+            </w:r>
+          </w:p>
+        </w:tc>
+        <w:tc>
+          <w:tcPr>
+            <w:shd w:fill="auto" w:val="clear"/>
+            <w:tcMar>
+              <w:top w:w="100.0" w:type="dxa"/>
+              <w:left w:w="100.0" w:type="dxa"/>
+              <w:bottom w:w="100.0" w:type="dxa"/>
+              <w:right w:w="100.0" w:type="dxa"/>
+            </w:tcMar>
+            <w:vAlign w:val="top"/>
+          </w:tcPr>
+          <w:p>
+            <w:pPr>
+              <w:keepNext w:val="0"/>
+              <w:keepLines w:val="0"/>
+              <w:pageBreakBefore w:val="0"/>
+              <w:widowControl w:val="0"/>
+              <w:pBdr>
+                <w:top w:space="0" w:sz="0" w:val="nil"/>
+                <w:left w:space="0" w:sz="0" w:val="nil"/>
+                <w:bottom w:space="0" w:sz="0" w:val="nil"/>
+                <w:right w:space="0" w:sz="0" w:val="nil"/>
+                <w:between w:space="0" w:sz="0" w:val="nil"/>
+              </w:pBdr>
+              <w:shd w:fill="auto" w:val="clear"/>
+              <w:spacing w:after="0" w:before="0" w:line="240" w:lineRule="auto"/>
+              <w:ind w:left="0" w:right="0" w:firstLine="0"/>
+              <w:jc w:val="left"/>
+              <w:rPr/>
+            </w:pPr>
+            <w:r>
+              <w:rPr/>
+              <w:drawing>
+                <wp:inline distB="114300" distT="114300" distL="114300" distR="114300">
+                  <wp:extent cx="1847850" cy="3263900"/>
+                  <wp:effectExtent b="0" l="0" r="0" t="0"/>
+                  <wp:docPr id="6" name="image18.png"/>
+                  <a:graphic>
+                    <a:graphicData uri="http://schemas.openxmlformats.org/drawingml/2006/picture">
+                      <pic:pic>
+                        <pic:nvPicPr>
+                          <pic:cNvPr id="0" name="image18.png"/>
+                          <pic:cNvPicPr preferRelativeResize="0"/>
+                        </pic:nvPicPr>
+                        <pic:blipFill>
+                          <a:blip r:embed="rId51"/>
+                          <a:srcRect b="0" l="0" r="0" t="0"/>
+                          <a:stretch>
+                            <a:fillRect/>
+                          </a:stretch>
+                        </pic:blipFill>
+                        <pic:spPr>
+                          <a:xfrm>
+                            <a:off x="0" y="0"/>
+                            <a:ext cx="1847850" cy="3263900"/>
+                          </a:xfrm>
+                          <a:prstGeom prst="rect"/>
+                          <a:ln/>
+                        </pic:spPr>
+                      </pic:pic>
+                    </a:graphicData>
+                  </a:graphic>
+                </wp:inline>
+              </w:drawing>
+            </w:r>
+            <w:r>
+              <w:rPr>
+                <w:rtl w:val="0"/>
+              </w:rPr>
+            </w:r>
+          </w:p>
+        </w:tc>
+      </w:tr>
+      <w:tr>
+        <w:trPr>
+          <w:cantSplit w:val="0"/>
+          <w:tblHeader w:val="0"/>
+        </w:trPr>
+        <w:tc>
+          <w:tcPr>
+            <w:shd w:fill="auto" w:val="clear"/>
+            <w:tcMar>
+              <w:top w:w="100.0" w:type="dxa"/>
+              <w:left w:w="100.0" w:type="dxa"/>
+              <w:bottom w:w="100.0" w:type="dxa"/>
+              <w:right w:w="100.0" w:type="dxa"/>
+            </w:tcMar>
+            <w:vAlign w:val="top"/>
+          </w:tcPr>
+          <w:p>
+            <w:pPr>
+              <w:keepNext w:val="0"/>
+              <w:keepLines w:val="0"/>
+              <w:pageBreakBefore w:val="0"/>
+              <w:widowControl w:val="0"/>
+              <w:pBdr>
+                <w:top w:space="0" w:sz="0" w:val="nil"/>
+                <w:left w:space="0" w:sz="0" w:val="nil"/>
+                <w:bottom w:space="0" w:sz="0" w:val="nil"/>
+                <w:right w:space="0" w:sz="0" w:val="nil"/>
+                <w:between w:space="0" w:sz="0" w:val="nil"/>
+              </w:pBdr>
+              <w:shd w:fill="auto" w:val="clear"/>
+              <w:spacing w:after="0" w:before="0" w:line="240" w:lineRule="auto"/>
+              <w:ind w:left="0" w:right="0" w:firstLine="0"/>
+              <w:jc w:val="left"/>
+              <w:rPr/>
+            </w:pPr>
+            <w:r>
+              <w:rPr>
+                <w:rtl w:val="0"/>
+              </w:rPr>
+            </w:r>
+          </w:p>
+        </w:tc>
+        <w:tc>
+          <w:tcPr>
+            <w:shd w:fill="auto" w:val="clear"/>
+            <w:tcMar>
+              <w:top w:w="100.0" w:type="dxa"/>
+              <w:left w:w="100.0" w:type="dxa"/>
+              <w:bottom w:w="100.0" w:type="dxa"/>
+              <w:right w:w="100.0" w:type="dxa"/>
+            </w:tcMar>
+            <w:vAlign w:val="top"/>
+          </w:tcPr>
+          <w:p>
+            <w:pPr>
+              <w:keepNext w:val="0"/>
+              <w:keepLines w:val="0"/>
+              <w:pageBreakBefore w:val="0"/>
+              <w:widowControl w:val="0"/>
+              <w:pBdr>
+                <w:top w:space="0" w:sz="0" w:val="nil"/>
+                <w:left w:space="0" w:sz="0" w:val="nil"/>
+                <w:bottom w:space="0" w:sz="0" w:val="nil"/>
+                <w:right w:space="0" w:sz="0" w:val="nil"/>
+                <w:between w:space="0" w:sz="0" w:val="nil"/>
+              </w:pBdr>
+              <w:shd w:fill="auto" w:val="clear"/>
+              <w:spacing w:after="0" w:before="0" w:line="240" w:lineRule="auto"/>
+              <w:ind w:left="0" w:right="0" w:firstLine="0"/>
+              <w:jc w:val="left"/>
+              <w:rPr/>
+            </w:pPr>
+            <w:r>
+              <w:rPr>
+                <w:rtl w:val="0"/>
+              </w:rPr>
+            </w:r>
+          </w:p>
+        </w:tc>
+        <w:tc>
+          <w:tcPr>
+            <w:shd w:fill="auto" w:val="clear"/>
+            <w:tcMar>
+              <w:top w:w="100.0" w:type="dxa"/>
+              <w:left w:w="100.0" w:type="dxa"/>
+              <w:bottom w:w="100.0" w:type="dxa"/>
+              <w:right w:w="100.0" w:type="dxa"/>
+            </w:tcMar>
+            <w:vAlign w:val="top"/>
+          </w:tcPr>
+          <w:p>
+            <w:pPr>
+              <w:keepNext w:val="0"/>
+              <w:keepLines w:val="0"/>
+              <w:pageBreakBefore w:val="0"/>
+              <w:widowControl w:val="0"/>
+              <w:pBdr>
+                <w:top w:space="0" w:sz="0" w:val="nil"/>
+                <w:left w:space="0" w:sz="0" w:val="nil"/>
+                <w:bottom w:space="0" w:sz="0" w:val="nil"/>
+                <w:right w:space="0" w:sz="0" w:val="nil"/>
+                <w:between w:space="0" w:sz="0" w:val="nil"/>
+              </w:pBdr>
+              <w:shd w:fill="auto" w:val="clear"/>
+              <w:spacing w:after="0" w:before="0" w:line="240" w:lineRule="auto"/>
+              <w:ind w:left="0" w:right="0" w:firstLine="0"/>
+              <w:jc w:val="left"/>
+              <w:rPr/>
+            </w:pPr>
+            <w:r>
+              <w:rPr>
+                <w:rtl w:val="0"/>
+              </w:rPr>
+            </w:r>
+          </w:p>
+        </w:tc>
+      </w:tr>
+      <w:tr>
+        <w:trPr>
+          <w:cantSplit w:val="0"/>
+          <w:tblHeader w:val="0"/>
+        </w:trPr>
+        <w:tc>
+          <w:tcPr>
+            <w:shd w:fill="auto" w:val="clear"/>
+            <w:tcMar>
+              <w:top w:w="100.0" w:type="dxa"/>
+              <w:left w:w="100.0" w:type="dxa"/>
+              <w:bottom w:w="100.0" w:type="dxa"/>
+              <w:right w:w="100.0" w:type="dxa"/>
+            </w:tcMar>
+            <w:vAlign w:val="top"/>
+          </w:tcPr>
+          <w:p>
+            <w:pPr>
+              <w:keepNext w:val="0"/>
+              <w:keepLines w:val="0"/>
+              <w:pageBreakBefore w:val="0"/>
+              <w:widowControl w:val="0"/>
+              <w:pBdr>
+                <w:top w:space="0" w:sz="0" w:val="nil"/>
+                <w:left w:space="0" w:sz="0" w:val="nil"/>
+                <w:bottom w:space="0" w:sz="0" w:val="nil"/>
+                <w:right w:space="0" w:sz="0" w:val="nil"/>
+                <w:between w:space="0" w:sz="0" w:val="nil"/>
+              </w:pBdr>
+              <w:shd w:fill="auto" w:val="clear"/>
+              <w:spacing w:after="0" w:before="0" w:line="240" w:lineRule="auto"/>
+              <w:ind w:left="0" w:right="0" w:firstLine="0"/>
+              <w:jc w:val="left"/>
+              <w:rPr/>
+            </w:pPr>
+            <w:r>
+              <w:rPr/>
+              <w:drawing>
+                <wp:inline distB="114300" distT="114300" distL="114300" distR="114300">
+                  <wp:extent cx="1847850" cy="3263900"/>
+                  <wp:effectExtent b="0" l="0" r="0" t="0"/>
+                  <wp:docPr id="31" name="image32.png"/>
+                  <a:graphic>
+                    <a:graphicData uri="http://schemas.openxmlformats.org/drawingml/2006/picture">
+                      <pic:pic>
+                        <pic:nvPicPr>
+                          <pic:cNvPr id="0" name="image32.png"/>
+                          <pic:cNvPicPr preferRelativeResize="0"/>
+                        </pic:nvPicPr>
+                        <pic:blipFill>
+                          <a:blip r:embed="rId52"/>
+                          <a:srcRect b="0" l="0" r="0" t="0"/>
+                          <a:stretch>
+                            <a:fillRect/>
+                          </a:stretch>
+                        </pic:blipFill>
+                        <pic:spPr>
+                          <a:xfrm>
+                            <a:off x="0" y="0"/>
+                            <a:ext cx="1847850" cy="3263900"/>
+                          </a:xfrm>
+                          <a:prstGeom prst="rect"/>
+                          <a:ln/>
+                        </pic:spPr>
+                      </pic:pic>
+                    </a:graphicData>
+                  </a:graphic>
+                </wp:inline>
+              </w:drawing>
+            </w:r>
+            <w:r>
+              <w:rPr>
+                <w:rtl w:val="0"/>
+              </w:rPr>
+            </w:r>
+          </w:p>
+        </w:tc>
+        <w:tc>
+          <w:tcPr>
+            <w:shd w:fill="auto" w:val="clear"/>
+            <w:tcMar>
+              <w:top w:w="100.0" w:type="dxa"/>
+              <w:left w:w="100.0" w:type="dxa"/>
+              <w:bottom w:w="100.0" w:type="dxa"/>
+              <w:right w:w="100.0" w:type="dxa"/>
+            </w:tcMar>
+            <w:vAlign w:val="top"/>
+          </w:tcPr>
+          <w:p>
+            <w:pPr>
+              <w:keepNext w:val="0"/>
+              <w:keepLines w:val="0"/>
+              <w:pageBreakBefore w:val="0"/>
+              <w:widowControl w:val="0"/>
+              <w:pBdr>
+                <w:top w:space="0" w:sz="0" w:val="nil"/>
+                <w:left w:space="0" w:sz="0" w:val="nil"/>
+                <w:bottom w:space="0" w:sz="0" w:val="nil"/>
+                <w:right w:space="0" w:sz="0" w:val="nil"/>
+                <w:between w:space="0" w:sz="0" w:val="nil"/>
+              </w:pBdr>
+              <w:shd w:fill="auto" w:val="clear"/>
+              <w:spacing w:after="0" w:before="0" w:line="240" w:lineRule="auto"/>
+              <w:ind w:left="0" w:right="0" w:firstLine="0"/>
+              <w:jc w:val="left"/>
+              <w:rPr/>
+            </w:pPr>
+            <w:r>
+              <w:rPr>
+                <w:rtl w:val="0"/>
+              </w:rPr>
+            </w:r>
+          </w:p>
+        </w:tc>
+        <w:tc>
+          <w:tcPr>
+            <w:shd w:fill="auto" w:val="clear"/>
+            <w:tcMar>
+              <w:top w:w="100.0" w:type="dxa"/>
+              <w:left w:w="100.0" w:type="dxa"/>
+              <w:bottom w:w="100.0" w:type="dxa"/>
+              <w:right w:w="100.0" w:type="dxa"/>
+            </w:tcMar>
+            <w:vAlign w:val="top"/>
+          </w:tcPr>
+          <w:p>
+            <w:pPr>
+              <w:keepNext w:val="0"/>
+              <w:keepLines w:val="0"/>
+              <w:pageBreakBefore w:val="0"/>
+              <w:widowControl w:val="0"/>
+              <w:pBdr>
+                <w:top w:space="0" w:sz="0" w:val="nil"/>
+                <w:left w:space="0" w:sz="0" w:val="nil"/>
+                <w:bottom w:space="0" w:sz="0" w:val="nil"/>
+                <w:right w:space="0" w:sz="0" w:val="nil"/>
+                <w:between w:space="0" w:sz="0" w:val="nil"/>
+              </w:pBdr>
+              <w:shd w:fill="auto" w:val="clear"/>
+              <w:spacing w:after="0" w:before="0" w:line="240" w:lineRule="auto"/>
+              <w:ind w:left="0" w:right="0" w:firstLine="0"/>
+              <w:jc w:val="left"/>
+              <w:rPr/>
+            </w:pPr>
+            <w:r>
+              <w:rPr>
+                <w:rtl w:val="0"/>
+              </w:rPr>
+            </w:r>
+          </w:p>
+        </w:tc>
+      </w:tr>
+      <w:tr>
+        <w:trPr>
+          <w:cantSplit w:val="0"/>
+          <w:tblHeader w:val="0"/>
+        </w:trPr>
+        <w:tc>
+          <w:tcPr>
+            <w:shd w:fill="auto" w:val="clear"/>
+            <w:tcMar>
+              <w:top w:w="100.0" w:type="dxa"/>
+              <w:left w:w="100.0" w:type="dxa"/>
+              <w:bottom w:w="100.0" w:type="dxa"/>
+              <w:right w:w="100.0" w:type="dxa"/>
+            </w:tcMar>
+            <w:vAlign w:val="top"/>
+          </w:tcPr>
+          <w:p>
+            <w:pPr>
+              <w:keepNext w:val="0"/>
+              <w:keepLines w:val="0"/>
+              <w:pageBreakBefore w:val="0"/>
+              <w:widowControl w:val="0"/>
+              <w:pBdr>
+                <w:top w:space="0" w:sz="0" w:val="nil"/>
+                <w:left w:space="0" w:sz="0" w:val="nil"/>
+                <w:bottom w:space="0" w:sz="0" w:val="nil"/>
+                <w:right w:space="0" w:sz="0" w:val="nil"/>
+                <w:between w:space="0" w:sz="0" w:val="nil"/>
+              </w:pBdr>
+              <w:shd w:fill="auto" w:val="clear"/>
+              <w:spacing w:after="0" w:before="0" w:line="240" w:lineRule="auto"/>
+              <w:ind w:left="0" w:right="0" w:firstLine="0"/>
+              <w:jc w:val="left"/>
+              <w:rPr/>
+            </w:pPr>
+            <w:r>
+              <w:rPr>
+                <w:rtl w:val="0"/>
+              </w:rPr>
+            </w:r>
+          </w:p>
+        </w:tc>
+        <w:tc>
+          <w:tcPr>
+            <w:shd w:fill="auto" w:val="clear"/>
+            <w:tcMar>
+              <w:top w:w="100.0" w:type="dxa"/>
+              <w:left w:w="100.0" w:type="dxa"/>
+              <w:bottom w:w="100.0" w:type="dxa"/>
+              <w:right w:w="100.0" w:type="dxa"/>
+            </w:tcMar>
+            <w:vAlign w:val="top"/>
+          </w:tcPr>
+          <w:p>
+            <w:pPr>
+              <w:keepNext w:val="0"/>
+              <w:keepLines w:val="0"/>
+              <w:pageBreakBefore w:val="0"/>
+              <w:widowControl w:val="0"/>
+              <w:pBdr>
+                <w:top w:space="0" w:sz="0" w:val="nil"/>
+                <w:left w:space="0" w:sz="0" w:val="nil"/>
+                <w:bottom w:space="0" w:sz="0" w:val="nil"/>
+                <w:right w:space="0" w:sz="0" w:val="nil"/>
+                <w:between w:space="0" w:sz="0" w:val="nil"/>
+              </w:pBdr>
+              <w:shd w:fill="auto" w:val="clear"/>
+              <w:spacing w:after="0" w:before="0" w:line="240" w:lineRule="auto"/>
+              <w:ind w:left="0" w:right="0" w:firstLine="0"/>
+              <w:jc w:val="left"/>
+              <w:rPr/>
+            </w:pPr>
+            <w:r>
+              <w:rPr>
+                <w:rtl w:val="0"/>
+              </w:rPr>
+            </w:r>
+          </w:p>
+        </w:tc>
+        <w:tc>
+          <w:tcPr>
+            <w:shd w:fill="auto" w:val="clear"/>
+            <w:tcMar>
+              <w:top w:w="100.0" w:type="dxa"/>
+              <w:left w:w="100.0" w:type="dxa"/>
+              <w:bottom w:w="100.0" w:type="dxa"/>
+              <w:right w:w="100.0" w:type="dxa"/>
+            </w:tcMar>
+            <w:vAlign w:val="top"/>
+          </w:tcPr>
+          <w:p>
+            <w:pPr>
+              <w:keepNext w:val="0"/>
+              <w:keepLines w:val="0"/>
+              <w:pageBreakBefore w:val="0"/>
+              <w:widowControl w:val="0"/>
+              <w:pBdr>
+                <w:top w:space="0" w:sz="0" w:val="nil"/>
+                <w:left w:space="0" w:sz="0" w:val="nil"/>
+                <w:bottom w:space="0" w:sz="0" w:val="nil"/>
+                <w:right w:space="0" w:sz="0" w:val="nil"/>
+                <w:between w:space="0" w:sz="0" w:val="nil"/>
+              </w:pBdr>
+              <w:shd w:fill="auto" w:val="clear"/>
+              <w:spacing w:after="0" w:before="0" w:line="240" w:lineRule="auto"/>
+              <w:ind w:left="0" w:right="0" w:firstLine="0"/>
+              <w:jc w:val="left"/>
+              <w:rPr/>
+            </w:pPr>
+            <w:r>
+              <w:rPr>
+                <w:rtl w:val="0"/>
+              </w:rPr>
+            </w:r>
+          </w:p>
+        </w:tc>
+      </w:tr>
+      <w:tr>
+        <w:trPr>
+          <w:cantSplit w:val="0"/>
+          <w:tblHeader w:val="0"/>
+        </w:trPr>
+        <w:tc>
+          <w:tcPr>
+            <w:shd w:fill="auto" w:val="clear"/>
+            <w:tcMar>
+              <w:top w:w="100.0" w:type="dxa"/>
+              <w:left w:w="100.0" w:type="dxa"/>
+              <w:bottom w:w="100.0" w:type="dxa"/>
+              <w:right w:w="100.0" w:type="dxa"/>
+            </w:tcMar>
+            <w:vAlign w:val="top"/>
+          </w:tcPr>
+          <w:p>
+            <w:pPr>
+              <w:keepNext w:val="0"/>
+              <w:keepLines w:val="0"/>
+              <w:pageBreakBefore w:val="0"/>
+              <w:widowControl w:val="0"/>
+              <w:pBdr>
+                <w:top w:space="0" w:sz="0" w:val="nil"/>
+                <w:left w:space="0" w:sz="0" w:val="nil"/>
+                <w:bottom w:space="0" w:sz="0" w:val="nil"/>
+                <w:right w:space="0" w:sz="0" w:val="nil"/>
+                <w:between w:space="0" w:sz="0" w:val="nil"/>
+              </w:pBdr>
+              <w:shd w:fill="auto" w:val="clear"/>
+              <w:spacing w:after="0" w:before="0" w:line="240" w:lineRule="auto"/>
+              <w:ind w:left="0" w:right="0" w:firstLine="0"/>
+              <w:jc w:val="left"/>
+              <w:rPr/>
+            </w:pPr>
+            <w:r>
+              <w:rPr>
+                <w:rtl w:val="0"/>
+              </w:rPr>
+            </w:r>
+          </w:p>
+        </w:tc>
+        <w:tc>
+          <w:tcPr>
+            <w:shd w:fill="auto" w:val="clear"/>
+            <w:tcMar>
+              <w:top w:w="100.0" w:type="dxa"/>
+              <w:left w:w="100.0" w:type="dxa"/>
+              <w:bottom w:w="100.0" w:type="dxa"/>
+              <w:right w:w="100.0" w:type="dxa"/>
+            </w:tcMar>
+            <w:vAlign w:val="top"/>
+          </w:tcPr>
+          <w:p>
+            <w:pPr>
+              <w:keepNext w:val="0"/>
+              <w:keepLines w:val="0"/>
+              <w:pageBreakBefore w:val="0"/>
+              <w:widowControl w:val="0"/>
+              <w:pBdr>
+                <w:top w:space="0" w:sz="0" w:val="nil"/>
+                <w:left w:space="0" w:sz="0" w:val="nil"/>
+                <w:bottom w:space="0" w:sz="0" w:val="nil"/>
+                <w:right w:space="0" w:sz="0" w:val="nil"/>
+                <w:between w:space="0" w:sz="0" w:val="nil"/>
+              </w:pBdr>
+              <w:shd w:fill="auto" w:val="clear"/>
+              <w:spacing w:after="0" w:before="0" w:line="240" w:lineRule="auto"/>
+              <w:ind w:left="0" w:right="0" w:firstLine="0"/>
+              <w:jc w:val="left"/>
+              <w:rPr/>
+            </w:pPr>
             <w:r>
               <w:rPr>
                 <w:rtl w:val="0"/>

</xml_diff>